<commit_message>
updated gitignore to ignore manim generated files
</commit_message>
<xml_diff>
--- a/Script.docx
+++ b/Script.docx
@@ -11,79 +11,64 @@
       <w:pPr>
         <w:jc w:val="both"/>
       </w:pPr>
-      <w:proofErr w:type="gramStart"/>
+      <w:r>
+        <w:t xml:space="preserve">So the purpose of this presentation is mostly showing </w:t>
+      </w:r>
+      <w:r>
+        <w:t xml:space="preserve">you the </w:t>
+      </w:r>
+      <w:r>
+        <w:t>interesting things I’ve encountered so far while studying Cellular Automata Theory</w:t>
+      </w:r>
+      <w:r>
+        <w:t>, not so much</w:t>
+      </w:r>
+      <w:r>
+        <w:t xml:space="preserve"> </w:t>
+      </w:r>
+      <w:r>
+        <w:t xml:space="preserve">the end result. </w:t>
+      </w:r>
+      <w:r>
+        <w:t xml:space="preserve">Now </w:t>
+      </w:r>
+      <w:r>
+        <w:t>in hindsight</w:t>
+      </w:r>
+      <w:r>
+        <w:t>, I can see a very easy path I could have taken to get there, and therefore to explain it</w:t>
+      </w:r>
+      <w:r>
+        <w:t xml:space="preserve">, compared to all I traveled to find it. </w:t>
+      </w:r>
+      <w:r>
+        <w:t xml:space="preserve">But as with most math problems, </w:t>
+      </w:r>
+      <w:r>
+        <w:t xml:space="preserve">that’s because I already found a solution. So if I only wanted to </w:t>
+      </w:r>
+      <w:r>
+        <w:t xml:space="preserve">show you the solution, this would be much quicker and </w:t>
+      </w:r>
+      <w:r>
+        <w:t>not</w:t>
+      </w:r>
+      <w:r>
+        <w:t xml:space="preserve"> so interesting, but I thought I could teach you all what I’ve seen just for the sake of it.</w:t>
+      </w:r>
+      <w:r>
+        <w:t xml:space="preserve"> Because I do think I found interesting things.</w:t>
+      </w:r>
+    </w:p>
+    <w:p>
+      <w:pPr>
+        <w:jc w:val="both"/>
+      </w:pPr>
       <w:r>
         <w:t>So</w:t>
       </w:r>
-      <w:proofErr w:type="gramEnd"/>
-      <w:r>
-        <w:t xml:space="preserve"> the purpose of this presentation is mostly </w:t>
-      </w:r>
-      <w:proofErr w:type="gramStart"/>
-      <w:r>
-        <w:t>showing</w:t>
-      </w:r>
-      <w:proofErr w:type="gramEnd"/>
-      <w:r>
-        <w:t xml:space="preserve"> </w:t>
-      </w:r>
-      <w:r>
-        <w:t xml:space="preserve">you the </w:t>
-      </w:r>
-      <w:r>
-        <w:t>interesting things I’ve encountered so far while studying Cellular Automata Theory</w:t>
-      </w:r>
-      <w:r>
-        <w:t>, not so much</w:t>
-      </w:r>
-      <w:r>
-        <w:t xml:space="preserve"> </w:t>
-      </w:r>
-      <w:proofErr w:type="gramStart"/>
-      <w:r>
-        <w:t>the end result</w:t>
-      </w:r>
-      <w:proofErr w:type="gramEnd"/>
-      <w:r>
-        <w:t xml:space="preserve">. </w:t>
-      </w:r>
-      <w:r>
-        <w:t xml:space="preserve">Now </w:t>
-      </w:r>
-      <w:r>
-        <w:t>in hindsight</w:t>
-      </w:r>
-      <w:r>
-        <w:t>, I can see a very easy path I could have taken to get there, and therefore to explain it</w:t>
-      </w:r>
-      <w:r>
-        <w:t xml:space="preserve">, compared to all I traveled to find it. </w:t>
-      </w:r>
-      <w:r>
-        <w:t xml:space="preserve">But as with most math problems, </w:t>
-      </w:r>
-      <w:r>
-        <w:t xml:space="preserve">that’s because I already found a solution. </w:t>
-      </w:r>
-      <w:proofErr w:type="gramStart"/>
-      <w:r>
-        <w:t>So</w:t>
-      </w:r>
-      <w:proofErr w:type="gramEnd"/>
-      <w:r>
-        <w:t xml:space="preserve"> if I only wanted to </w:t>
-      </w:r>
-      <w:r>
-        <w:t xml:space="preserve">show you the solution, this would be much quicker and </w:t>
-      </w:r>
-      <w:r>
-        <w:t>not</w:t>
-      </w:r>
-      <w:r>
-        <w:t xml:space="preserve"> so interesting, but I thought I could teach you all what I’ve seen just for the sake of it.</w:t>
-      </w:r>
-      <w:r>
-        <w:t xml:space="preserve"> Because I do think I found interesting things.</w:t>
+      <w:r>
+        <w:t>, I present to you, Cellular Automata.</w:t>
       </w:r>
     </w:p>
     <w:p>
@@ -91,26 +76,7 @@
         <w:jc w:val="both"/>
       </w:pPr>
       <w:r>
-        <w:t>So</w:t>
-      </w:r>
-      <w:r>
-        <w:t>, I present to you, Cellular Automata.</w:t>
-      </w:r>
-    </w:p>
-    <w:p>
-      <w:pPr>
-        <w:jc w:val="both"/>
-      </w:pPr>
-      <w:r>
-        <w:t xml:space="preserve">I have a question for you </w:t>
-      </w:r>
-      <w:proofErr w:type="gramStart"/>
-      <w:r>
-        <w:t>guys,</w:t>
-      </w:r>
-      <w:proofErr w:type="gramEnd"/>
-      <w:r>
-        <w:t xml:space="preserve"> do you all know about the game of life?</w:t>
+        <w:t>I have a question for you guys, do you all know about the game of life?</w:t>
       </w:r>
       <w:r>
         <w:t xml:space="preserve"> What do you know about it?</w:t>
@@ -153,7 +119,10 @@
         <w:jc w:val="both"/>
       </w:pPr>
       <w:r>
-        <w:t xml:space="preserve">The Game of Life goes like this. You start with a grid of cells. You can imagine them as the cells in your </w:t>
+        <w:t>The game of life features a square grid of cells</w:t>
+      </w:r>
+      <w:r>
+        <w:t xml:space="preserve">. You can imagine them as the cells in your </w:t>
       </w:r>
       <w:r>
         <w:t>skin</w:t>
@@ -174,15 +143,7 @@
         <w:t>unlike the cells in your skin, the set of rules managing them is much simpler.</w:t>
       </w:r>
       <w:r>
-        <w:t xml:space="preserve"> The game goes by </w:t>
-      </w:r>
-      <w:proofErr w:type="gramStart"/>
-      <w:r>
-        <w:t>steps</w:t>
-      </w:r>
-      <w:proofErr w:type="gramEnd"/>
-      <w:r>
-        <w:t xml:space="preserve">. In each step, every cell updates at the </w:t>
+        <w:t xml:space="preserve"> The game goes by steps. In each step, every cell updates at the </w:t>
       </w:r>
       <w:r>
         <w:t xml:space="preserve">same time, based on their </w:t>
@@ -209,7 +170,16 @@
         <w:t xml:space="preserve">if </w:t>
       </w:r>
       <w:r>
-        <w:t>only if it has 2 or 3 alive neighbors. Anything else is under</w:t>
+        <w:t xml:space="preserve">and </w:t>
+      </w:r>
+      <w:r>
+        <w:t xml:space="preserve">only if it has 2 or 3 alive neighbors. Anything else </w:t>
+      </w:r>
+      <w:r>
+        <w:t>and it dies by</w:t>
+      </w:r>
+      <w:r>
+        <w:t xml:space="preserve"> under</w:t>
       </w:r>
       <w:r>
         <w:t>-</w:t>
@@ -261,15 +231,7 @@
         <w:t xml:space="preserve">More specifically, he wanted to know if you could make a system where a robot could replicate itself. Just like bacteria or humans that marry their </w:t>
       </w:r>
       <w:r>
-        <w:t xml:space="preserve">twins. </w:t>
-      </w:r>
-      <w:proofErr w:type="gramStart"/>
-      <w:r>
-        <w:t>So</w:t>
-      </w:r>
-      <w:proofErr w:type="gramEnd"/>
-      <w:r>
-        <w:t xml:space="preserve"> he built this system </w:t>
+        <w:t xml:space="preserve">twins. So he built this system </w:t>
       </w:r>
       <w:r>
         <w:t xml:space="preserve">to have a simple framework to work with. </w:t>
@@ -370,37 +332,13 @@
         <w:jc w:val="both"/>
       </w:pPr>
       <w:r>
-        <w:t xml:space="preserve">Well, because it is Turing complete, </w:t>
-      </w:r>
-      <w:proofErr w:type="gramStart"/>
-      <w:r>
-        <w:t>and also</w:t>
-      </w:r>
-      <w:proofErr w:type="gramEnd"/>
-      <w:r>
-        <w:t xml:space="preserve"> 2 dimensional. The reason this is relevant is because </w:t>
-      </w:r>
-      <w:r>
-        <w:t xml:space="preserve">as you already know, a quantum circuit </w:t>
-      </w:r>
-      <w:proofErr w:type="gramStart"/>
-      <w:r>
-        <w:t>has to</w:t>
-      </w:r>
-      <w:proofErr w:type="gramEnd"/>
-      <w:r>
-        <w:t xml:space="preserve"> be reversible</w:t>
-      </w:r>
-      <w:r>
-        <w:t xml:space="preserve">. </w:t>
-      </w:r>
-      <w:proofErr w:type="gramStart"/>
-      <w:r>
-        <w:t>So</w:t>
-      </w:r>
-      <w:proofErr w:type="gramEnd"/>
-      <w:r>
-        <w:t xml:space="preserve"> if we want to make a Quantum Circuit that is Turing complete, we need to find a way </w:t>
+        <w:t xml:space="preserve">Well, because it is Turing complete, and also 2 dimensional. The reason this is relevant is because </w:t>
+      </w:r>
+      <w:r>
+        <w:t>as you already know, a quantum circuit has to be reversible</w:t>
+      </w:r>
+      <w:r>
+        <w:t xml:space="preserve">. So if we want to make a Quantum Circuit that is Turing complete, we need to find a way </w:t>
       </w:r>
       <w:r>
         <w:t>to make a Turing Machine that is reversible</w:t>
@@ -415,23 +353,7 @@
         <w:t xml:space="preserve">It feels like it doesn’t need much to become reversible, but sadly, it </w:t>
       </w:r>
       <w:r>
-        <w:t xml:space="preserve">is not by </w:t>
-      </w:r>
-      <w:proofErr w:type="gramStart"/>
-      <w:r>
-        <w:t>default</w:t>
-      </w:r>
-      <w:proofErr w:type="gramEnd"/>
-      <w:r>
-        <w:t xml:space="preserve">, and it is </w:t>
-      </w:r>
-      <w:proofErr w:type="gramStart"/>
-      <w:r>
-        <w:t>actually hard</w:t>
-      </w:r>
-      <w:proofErr w:type="gramEnd"/>
-      <w:r>
-        <w:t xml:space="preserve"> to make it reversible.</w:t>
+        <w:t>is not by default, and it is actually hard to make it reversible.</w:t>
       </w:r>
     </w:p>
     <w:p>
@@ -445,15 +367,7 @@
         <w:t>?</w:t>
       </w:r>
       <w:r>
-        <w:t xml:space="preserve"> And as with most difficult problems in math it’s worth finding first the easiest, non-trivial instance of the problem, and </w:t>
-      </w:r>
-      <w:proofErr w:type="gramStart"/>
-      <w:r>
-        <w:t>see</w:t>
-      </w:r>
-      <w:proofErr w:type="gramEnd"/>
-      <w:r>
-        <w:t xml:space="preserve"> what you find.</w:t>
+        <w:t xml:space="preserve"> And as with most difficult problems in math it’s worth finding first the easiest, non-trivial instance of the problem, and see what you find.</w:t>
       </w:r>
       <w:r>
         <w:t xml:space="preserve"> And then work your way up.</w:t>
@@ -463,13 +377,8 @@
       <w:pPr>
         <w:jc w:val="both"/>
       </w:pPr>
-      <w:proofErr w:type="gramStart"/>
-      <w:r>
-        <w:t>So</w:t>
-      </w:r>
-      <w:proofErr w:type="gramEnd"/>
-      <w:r>
-        <w:t xml:space="preserve"> what is such an example? To answer that, we first need to see the formal definition of Cellular Automata, to know what </w:t>
+      <w:r>
+        <w:t xml:space="preserve">So what is such an example? To answer that, we first need to see the formal definition of Cellular Automata, to know what </w:t>
       </w:r>
       <w:r>
         <w:t xml:space="preserve">defines one and what </w:t>
@@ -507,13 +416,8 @@
       <w:pPr>
         <w:jc w:val="both"/>
       </w:pPr>
-      <w:proofErr w:type="gramStart"/>
-      <w:r>
-        <w:t>First of all</w:t>
-      </w:r>
-      <w:proofErr w:type="gramEnd"/>
-      <w:r>
-        <w:t xml:space="preserve">, we have the state alphabet. </w:t>
+      <w:r>
+        <w:t xml:space="preserve">First of all, we have the state alphabet. </w:t>
       </w:r>
       <w:r>
         <w:t>It’s a set telling you what states are allowed. Not every CA is</w:t>
@@ -524,13 +428,8 @@
       <w:r>
         <w:t xml:space="preserve"> </w:t>
       </w:r>
-      <w:proofErr w:type="gramStart"/>
-      <w:r>
-        <w:t>life or death</w:t>
-      </w:r>
-      <w:proofErr w:type="gramEnd"/>
-      <w:r>
-        <w:t xml:space="preserve"> situation. </w:t>
+      <w:r>
+        <w:t xml:space="preserve">life or death situation. </w:t>
       </w:r>
       <w:r>
         <w:t xml:space="preserve">Here is one that uses </w:t>
@@ -547,169 +446,106 @@
       <w:r>
         <w:t xml:space="preserve">But </w:t>
       </w:r>
-      <w:proofErr w:type="gramStart"/>
-      <w:r>
-        <w:t>of course</w:t>
-      </w:r>
-      <w:proofErr w:type="gramEnd"/>
+      <w:r>
+        <w:t xml:space="preserve">of course </w:t>
+      </w:r>
+      <w:r>
+        <w:t xml:space="preserve">two </w:t>
+      </w:r>
+      <w:r>
+        <w:t>states</w:t>
+      </w:r>
+      <w:r>
+        <w:t xml:space="preserve"> is</w:t>
+      </w:r>
+      <w:r>
+        <w:t xml:space="preserve"> the simplest case, so we will use that for our first and easiest instance</w:t>
+      </w:r>
+      <w:r>
+        <w:t>.</w:t>
+      </w:r>
+    </w:p>
+    <w:p>
+      <w:pPr>
+        <w:pStyle w:val="Subtitle"/>
+      </w:pPr>
+      <w:r>
+        <w:t>Cell array</w:t>
+      </w:r>
+    </w:p>
+    <w:p>
+      <w:pPr>
+        <w:jc w:val="both"/>
+      </w:pPr>
+      <w:r>
+        <w:t xml:space="preserve">Next we have to define our cells. What grid are we working on? And </w:t>
+      </w:r>
+      <w:r>
+        <w:t xml:space="preserve">is it </w:t>
+      </w:r>
+      <w:r>
+        <w:t>also 2 dimensional?</w:t>
+      </w:r>
+      <w:r>
+        <w:t xml:space="preserve"> The d on top tells us the dimension of the cell array, and is mostly what we will change</w:t>
+      </w:r>
+      <w:r>
+        <w:t xml:space="preserve">, but the reason for it to be written this way, is that we don’t </w:t>
+      </w:r>
+      <w:r>
+        <w:t xml:space="preserve">need to use a square grid, some CAs are defined using </w:t>
+      </w:r>
+      <w:r>
+        <w:t>some other way of tiling the space.</w:t>
+      </w:r>
       <w:r>
         <w:t xml:space="preserve"> </w:t>
       </w:r>
       <w:r>
-        <w:t xml:space="preserve">two </w:t>
-      </w:r>
-      <w:r>
-        <w:t>states</w:t>
-      </w:r>
-      <w:r>
-        <w:t xml:space="preserve"> </w:t>
-      </w:r>
-      <w:proofErr w:type="gramStart"/>
-      <w:r>
-        <w:t>is</w:t>
-      </w:r>
-      <w:proofErr w:type="gramEnd"/>
-      <w:r>
-        <w:t xml:space="preserve"> the simplest case, so we will use that for our first and easiest instance</w:t>
-      </w:r>
-      <w:r>
-        <w:t>.</w:t>
-      </w:r>
-    </w:p>
-    <w:p>
-      <w:pPr>
-        <w:pStyle w:val="Subtitle"/>
-      </w:pPr>
-      <w:r>
-        <w:t>Cell array</w:t>
-      </w:r>
-    </w:p>
-    <w:p>
-      <w:pPr>
-        <w:jc w:val="both"/>
-      </w:pPr>
-      <w:proofErr w:type="gramStart"/>
-      <w:r>
-        <w:t>Next</w:t>
-      </w:r>
-      <w:proofErr w:type="gramEnd"/>
-      <w:r>
-        <w:t xml:space="preserve"> we </w:t>
-      </w:r>
-      <w:proofErr w:type="gramStart"/>
-      <w:r>
-        <w:t>have to</w:t>
-      </w:r>
-      <w:proofErr w:type="gramEnd"/>
-      <w:r>
-        <w:t xml:space="preserve"> define our cells. What grid are we working on? And </w:t>
-      </w:r>
-      <w:r>
-        <w:t xml:space="preserve">is it </w:t>
-      </w:r>
-      <w:r>
-        <w:t>also 2 dimensional?</w:t>
-      </w:r>
-      <w:r>
-        <w:t xml:space="preserve"> The d on top tells us the dimension of the cell array, and is mostly what we will change</w:t>
-      </w:r>
-      <w:r>
-        <w:t xml:space="preserve">, but the reason for it to be written this way, is that we don’t </w:t>
-      </w:r>
-      <w:r>
-        <w:t xml:space="preserve">need to use a square grid, some CAs are defined using </w:t>
-      </w:r>
-      <w:r>
-        <w:t>some other way of tiling the space.</w:t>
-      </w:r>
-      <w:r>
-        <w:t xml:space="preserve"> </w:t>
-      </w:r>
-      <w:r>
         <w:t xml:space="preserve">A good </w:t>
       </w:r>
       <w:r>
-        <w:t xml:space="preserve">example of this is using hexagons. As it turns out, you can model </w:t>
-      </w:r>
-      <w:proofErr w:type="gramStart"/>
-      <w:r>
-        <w:t>pretty well</w:t>
-      </w:r>
-      <w:proofErr w:type="gramEnd"/>
-      <w:r>
-        <w:t xml:space="preserve"> how snowflakes form using these CA. Here’s an example. And another example I found online </w:t>
+        <w:t xml:space="preserve">example of this is using hexagons. As it turns out, you can model pretty well how snowflakes form using these CA. Here’s an example. And another example I found online </w:t>
       </w:r>
       <w:r>
         <w:lastRenderedPageBreak/>
         <w:t xml:space="preserve">was </w:t>
       </w:r>
       <w:r>
-        <w:t xml:space="preserve">Game of </w:t>
-      </w:r>
-      <w:proofErr w:type="gramStart"/>
-      <w:r>
-        <w:t>Life, but</w:t>
-      </w:r>
-      <w:proofErr w:type="gramEnd"/>
+        <w:t xml:space="preserve">Game of Life, but </w:t>
+      </w:r>
+      <w:r>
+        <w:t>made using Einstein</w:t>
+      </w:r>
+      <w:r>
+        <w:t xml:space="preserve"> tiling. It is a fairly recently discovered shape that is amorphous, yet it can tile the whole</w:t>
+      </w:r>
+      <w:r>
+        <w:t xml:space="preserve"> plane</w:t>
+      </w:r>
+      <w:r>
+        <w:t xml:space="preserve"> in a non-periodic way</w:t>
+      </w:r>
+      <w:r>
+        <w:t xml:space="preserve">. It’s called einstein </w:t>
+      </w:r>
+      <w:r>
+        <w:t>because it is one stone, not because it has anything to do with the famous german physician.</w:t>
+      </w:r>
       <w:r>
         <w:t xml:space="preserve"> </w:t>
       </w:r>
       <w:r>
-        <w:t>made using Einstein</w:t>
-      </w:r>
-      <w:r>
-        <w:t xml:space="preserve"> tiling. It is a </w:t>
-      </w:r>
-      <w:proofErr w:type="gramStart"/>
-      <w:r>
-        <w:t>fairly recently</w:t>
-      </w:r>
-      <w:proofErr w:type="gramEnd"/>
-      <w:r>
-        <w:t xml:space="preserve"> discovered shape that is amorphous, yet it can tile the whole</w:t>
-      </w:r>
-      <w:r>
-        <w:t xml:space="preserve"> plane</w:t>
-      </w:r>
-      <w:r>
-        <w:t xml:space="preserve"> in a non-periodic way</w:t>
-      </w:r>
-      <w:r>
-        <w:t xml:space="preserve">. It’s called einstein </w:t>
-      </w:r>
-      <w:r>
-        <w:t xml:space="preserve">because it is one stone, not because it has anything to do with the famous </w:t>
-      </w:r>
-      <w:proofErr w:type="spellStart"/>
-      <w:r>
-        <w:t>german</w:t>
-      </w:r>
-      <w:proofErr w:type="spellEnd"/>
-      <w:r>
-        <w:t xml:space="preserve"> physician.</w:t>
+        <w:t>Before this we had sets of tiles that could do the same, but whether one</w:t>
       </w:r>
       <w:r>
         <w:t xml:space="preserve"> </w:t>
       </w:r>
       <w:r>
-        <w:t>Before this we had sets of tiles that could do the same, but whether one</w:t>
-      </w:r>
-      <w:r>
-        <w:t xml:space="preserve"> </w:t>
-      </w:r>
-      <w:r>
         <w:t>tile could do it was an open question. Now we have a family of tiles.</w:t>
       </w:r>
       <w:r>
-        <w:t xml:space="preserve"> This one was the first one as it’s called the einstein hat, because it </w:t>
-      </w:r>
-      <w:proofErr w:type="spellStart"/>
-      <w:r>
-        <w:t>kinda</w:t>
-      </w:r>
-      <w:proofErr w:type="spellEnd"/>
-      <w:r>
-        <w:t>’ looks like a hat.</w:t>
+        <w:t xml:space="preserve"> This one was the first one as it’s called the einstein hat, because it kinda’ looks like a hat.</w:t>
       </w:r>
     </w:p>
     <w:p>

</xml_diff>

<commit_message>
Explanations of GOL rules
</commit_message>
<xml_diff>
--- a/Script.docx
+++ b/Script.docx
@@ -131,7 +131,13 @@
         <w:t xml:space="preserve">. </w:t>
       </w:r>
       <w:r>
-        <w:t>And just like the cells in your skin, they can be dead</w:t>
+        <w:t>And just like the cells in your skin</w:t>
+      </w:r>
+      <w:r>
+        <w:t xml:space="preserve"> after a day at the beach</w:t>
+      </w:r>
+      <w:r>
+        <w:t>, they can be dead</w:t>
       </w:r>
       <w:r>
         <w:t xml:space="preserve"> or alive</w:t>
@@ -161,6 +167,12 @@
         <w:t>exactly three live neighbors, it becomes alive on the next step, as if by reproduction.</w:t>
       </w:r>
       <w:r>
+        <w:t xml:space="preserve"> Except it has not 2, but 3 parents, which I can only imagine makes it much easier to afford</w:t>
+      </w:r>
+      <w:r>
+        <w:t xml:space="preserve"> children.</w:t>
+      </w:r>
+      <w:r>
         <w:t xml:space="preserve"> And a life cell will continue to </w:t>
       </w:r>
       <w:r>
@@ -193,7 +205,13 @@
         <w:jc w:val="both"/>
       </w:pPr>
       <w:r>
-        <w:t>The impressive thing here is that these two rules, although very simple, allow for some very complex behavior, up to the point of Turing completeness.</w:t>
+        <w:t xml:space="preserve">The impressive thing here is that these two rules, although very simple, allow for some very complex </w:t>
+      </w:r>
+      <w:r>
+        <w:t xml:space="preserve">emergent </w:t>
+      </w:r>
+      <w:r>
+        <w:t>behavior, up to the point of Turing completeness.</w:t>
       </w:r>
     </w:p>
     <w:p>
@@ -213,7 +231,32 @@
         <w:t>had computers that would run it for him.</w:t>
       </w:r>
       <w:r>
-        <w:t xml:space="preserve"> He started with a “similar” game made by </w:t>
+        <w:t xml:space="preserve"> </w:t>
+      </w:r>
+      <w:r>
+        <w:t xml:space="preserve">He had to test it by hand, as well as the other prototypes he </w:t>
+      </w:r>
+      <w:r>
+        <w:t>made before finding the perfect ruleset</w:t>
+      </w:r>
+      <w:r>
+        <w:t xml:space="preserve">, which </w:t>
+      </w:r>
+      <w:r>
+        <w:rPr>
+          <w:b/>
+          <w:bCs/>
+        </w:rPr>
+        <w:t>really</w:t>
+      </w:r>
+      <w:r>
+        <w:t xml:space="preserve"> makes me happy I live in the future.</w:t>
+      </w:r>
+      <w:r>
+        <w:t xml:space="preserve"> </w:t>
+      </w:r>
+      <w:r>
+        <w:t xml:space="preserve">He started with a “similar” game made by </w:t>
       </w:r>
       <w:r>
         <w:t xml:space="preserve">the one and only von Neumann, where he tried to make a system capable of </w:t>
@@ -228,7 +271,13 @@
         <w:t xml:space="preserve">behaviors, by having very simple rules. </w:t>
       </w:r>
       <w:r>
-        <w:t xml:space="preserve">More specifically, he wanted to know if you could make a system where a robot could replicate itself. Just like bacteria or humans that marry their </w:t>
+        <w:t xml:space="preserve">More specifically, he wanted to know if you could make a system where a robot could replicate itself. Just like bacteria </w:t>
+      </w:r>
+      <w:r>
+        <w:t xml:space="preserve">when dividing </w:t>
+      </w:r>
+      <w:r>
+        <w:t xml:space="preserve">or humans that marry their </w:t>
       </w:r>
       <w:r>
         <w:t xml:space="preserve">twins. So he built this system </w:t>
@@ -240,7 +289,11 @@
         <w:t>The one from von Neumann tho, was much more complicated.</w:t>
       </w:r>
       <w:r>
-        <w:t xml:space="preserve"> It had 29</w:t>
+        <w:t xml:space="preserve"> It </w:t>
+      </w:r>
+      <w:r>
+        <w:lastRenderedPageBreak/>
+        <w:t>had 29</w:t>
       </w:r>
       <w:r>
         <w:t> states per cell</w:t>
@@ -272,7 +325,6 @@
         <w:jc w:val="both"/>
       </w:pPr>
       <w:r>
-        <w:lastRenderedPageBreak/>
         <w:t xml:space="preserve">And </w:t>
       </w:r>
       <w:r>
@@ -493,7 +545,11 @@
         <w:t xml:space="preserve">, but the reason for it to be written this way, is that we don’t </w:t>
       </w:r>
       <w:r>
-        <w:t xml:space="preserve">need to use a square grid, some CAs are defined using </w:t>
+        <w:t xml:space="preserve">need to use a </w:t>
+      </w:r>
+      <w:r>
+        <w:lastRenderedPageBreak/>
+        <w:t xml:space="preserve">square grid, some CAs are defined using </w:t>
       </w:r>
       <w:r>
         <w:t>some other way of tiling the space.</w:t>
@@ -505,11 +561,7 @@
         <w:t xml:space="preserve">A good </w:t>
       </w:r>
       <w:r>
-        <w:t xml:space="preserve">example of this is using hexagons. As it turns out, you can model pretty well how snowflakes form using these CA. Here’s an example. And another example I found online </w:t>
-      </w:r>
-      <w:r>
-        <w:lastRenderedPageBreak/>
-        <w:t xml:space="preserve">was </w:t>
+        <w:t xml:space="preserve">example of this is using hexagons. As it turns out, you can model pretty well how snowflakes form using these CA. Here’s an example. And another example I found online was </w:t>
       </w:r>
       <w:r>
         <w:t xml:space="preserve">Game of Life, but </w:t>
@@ -530,7 +582,15 @@
         <w:t xml:space="preserve">. It’s called einstein </w:t>
       </w:r>
       <w:r>
-        <w:t>because it is one stone, not because it has anything to do with the famous german physician.</w:t>
+        <w:t xml:space="preserve">because it is one stone, not because it has anything to do with the famous </w:t>
+      </w:r>
+      <w:proofErr w:type="spellStart"/>
+      <w:r>
+        <w:t>german</w:t>
+      </w:r>
+      <w:proofErr w:type="spellEnd"/>
+      <w:r>
+        <w:t xml:space="preserve"> physician.</w:t>
       </w:r>
       <w:r>
         <w:t xml:space="preserve"> </w:t>
@@ -545,7 +605,15 @@
         <w:t>tile could do it was an open question. Now we have a family of tiles.</w:t>
       </w:r>
       <w:r>
-        <w:t xml:space="preserve"> This one was the first one as it’s called the einstein hat, because it kinda’ looks like a hat.</w:t>
+        <w:t xml:space="preserve"> This one was the first one as it’s called the einstein hat, because it </w:t>
+      </w:r>
+      <w:proofErr w:type="spellStart"/>
+      <w:r>
+        <w:t>kinda</w:t>
+      </w:r>
+      <w:proofErr w:type="spellEnd"/>
+      <w:r>
+        <w:t>’ looks like a hat.</w:t>
       </w:r>
     </w:p>
     <w:p>

</xml_diff>

<commit_message>
Started Elementary CA explanation
</commit_message>
<xml_diff>
--- a/Script.docx
+++ b/Script.docx
@@ -57,7 +57,13 @@
         <w:t xml:space="preserve"> so interesting, but I thought I could teach you all what I’ve seen just for the sake of it.</w:t>
       </w:r>
       <w:r>
-        <w:t xml:space="preserve"> Because I do think I found interesting things.</w:t>
+        <w:t xml:space="preserve"> Because I do think I found </w:t>
+      </w:r>
+      <w:r>
+        <w:t xml:space="preserve">some </w:t>
+      </w:r>
+      <w:r>
+        <w:t>interesting things.</w:t>
       </w:r>
     </w:p>
     <w:p>
@@ -252,86 +258,112 @@
       <w:r>
         <w:t xml:space="preserve"> makes me happy I live in the future.</w:t>
       </w:r>
+    </w:p>
+    <w:p>
+      <w:pPr>
+        <w:jc w:val="both"/>
+      </w:pPr>
+      <w:r>
+        <w:t>{Maybe add this, maybe not</w:t>
+      </w:r>
+      <w:r>
+        <w:t>} (</w:t>
+      </w:r>
+      <w:r>
+        <w:t xml:space="preserve">He started with a “similar” game made by </w:t>
+      </w:r>
+      <w:r>
+        <w:t xml:space="preserve">the one and only von Neumann, where he tried to make a system capable of </w:t>
+      </w:r>
+      <w:r>
+        <w:t>having</w:t>
+      </w:r>
+      <w:r>
+        <w:t xml:space="preserve"> complex </w:t>
+      </w:r>
+      <w:r>
+        <w:t xml:space="preserve">behaviors, by having very simple rules. </w:t>
+      </w:r>
+      <w:r>
+        <w:t xml:space="preserve">More specifically, he wanted to know if you could make a system where a robot could replicate itself. Just like bacteria </w:t>
+      </w:r>
+      <w:r>
+        <w:t xml:space="preserve">when dividing </w:t>
+      </w:r>
+      <w:r>
+        <w:t xml:space="preserve">or humans that marry </w:t>
+      </w:r>
+      <w:r>
+        <w:lastRenderedPageBreak/>
+        <w:t xml:space="preserve">their </w:t>
+      </w:r>
+      <w:r>
+        <w:t xml:space="preserve">twins. So he built this system </w:t>
+      </w:r>
+      <w:r>
+        <w:t xml:space="preserve">to have a simple framework to work with. </w:t>
+      </w:r>
+      <w:r>
+        <w:t>The one from von Neumann tho, was much more complicated.</w:t>
+      </w:r>
+      <w:r>
+        <w:t xml:space="preserve"> It had 29</w:t>
+      </w:r>
+      <w:r>
+        <w:t> states per cell</w:t>
+      </w:r>
+      <w:r>
+        <w:t xml:space="preserve">, and a lot of complicated rules. </w:t>
+      </w:r>
+      <w:r>
+        <w:t>It</w:t>
+      </w:r>
+      <w:r>
+        <w:t xml:space="preserve"> did accomplish its purpose</w:t>
+      </w:r>
+      <w:r>
+        <w:t xml:space="preserve">, but John Connway thought he could do </w:t>
+      </w:r>
+      <w:r>
+        <w:t xml:space="preserve">much </w:t>
+      </w:r>
+      <w:r>
+        <w:t xml:space="preserve">better, and after many iterations, </w:t>
+      </w:r>
+      <w:r>
+        <w:t>much better he did.</w:t>
+      </w:r>
+      <w:r>
+        <w:t>)</w:t>
+      </w:r>
+    </w:p>
+    <w:p>
+      <w:pPr>
+        <w:jc w:val="both"/>
+      </w:pPr>
+      <w:r>
+        <w:t xml:space="preserve">And </w:t>
+      </w:r>
+      <w:r>
+        <w:t xml:space="preserve">so many </w:t>
+      </w:r>
+      <w:r>
+        <w:t>people loved it</w:t>
+      </w:r>
+      <w:r>
+        <w:t xml:space="preserve"> and started playing with it</w:t>
+      </w:r>
+      <w:r>
+        <w:t>,</w:t>
+      </w:r>
+      <w:r>
+        <w:t xml:space="preserve"> a</w:t>
+      </w:r>
       <w:r>
         <w:t xml:space="preserve"> </w:t>
       </w:r>
       <w:r>
-        <w:t xml:space="preserve">He started with a “similar” game made by </w:t>
-      </w:r>
-      <w:r>
-        <w:t xml:space="preserve">the one and only von Neumann, where he tried to make a system capable of </w:t>
-      </w:r>
-      <w:r>
-        <w:t>having</w:t>
-      </w:r>
-      <w:r>
-        <w:t xml:space="preserve"> complex </w:t>
-      </w:r>
-      <w:r>
-        <w:t xml:space="preserve">behaviors, by having very simple rules. </w:t>
-      </w:r>
-      <w:r>
-        <w:t xml:space="preserve">More specifically, he wanted to know if you could make a system where a robot could replicate itself. Just like bacteria </w:t>
-      </w:r>
-      <w:r>
-        <w:t xml:space="preserve">when dividing </w:t>
-      </w:r>
-      <w:r>
-        <w:t xml:space="preserve">or humans that marry their </w:t>
-      </w:r>
-      <w:r>
-        <w:t xml:space="preserve">twins. So he built this system </w:t>
-      </w:r>
-      <w:r>
-        <w:t xml:space="preserve">to have a simple framework to work with. </w:t>
-      </w:r>
-      <w:r>
-        <w:t>The one from von Neumann tho, was much more complicated.</w:t>
-      </w:r>
-      <w:r>
-        <w:t xml:space="preserve"> It </w:t>
-      </w:r>
-      <w:r>
-        <w:lastRenderedPageBreak/>
-        <w:t>had 29</w:t>
-      </w:r>
-      <w:r>
-        <w:t> states per cell</w:t>
-      </w:r>
-      <w:r>
-        <w:t xml:space="preserve">, and a lot of complicated rules. </w:t>
-      </w:r>
-      <w:r>
-        <w:t>It</w:t>
-      </w:r>
-      <w:r>
-        <w:t xml:space="preserve"> did accomplish its purpose</w:t>
-      </w:r>
-      <w:r>
-        <w:t xml:space="preserve">, but John Connway thought he could do </w:t>
-      </w:r>
-      <w:r>
-        <w:t xml:space="preserve">much </w:t>
-      </w:r>
-      <w:r>
-        <w:t xml:space="preserve">better, and after many iterations, </w:t>
-      </w:r>
-      <w:r>
-        <w:t>much better he did.</w:t>
-      </w:r>
-    </w:p>
-    <w:p>
-      <w:pPr>
-        <w:jc w:val="both"/>
-      </w:pPr>
-      <w:r>
-        <w:t xml:space="preserve">And </w:t>
-      </w:r>
-      <w:r>
-        <w:t>all of people loved it</w:t>
-      </w:r>
-      <w:r>
-        <w:t>. Very quickly, a big community formed. And they have accomplished amazing things.</w:t>
+        <w:t>big community formed. And they have accomplished amazing things.</w:t>
       </w:r>
       <w:r>
         <w:t xml:space="preserve"> By choosing carefully which cells start alive, </w:t>
@@ -356,7 +388,10 @@
         <w:t xml:space="preserve">can </w:t>
       </w:r>
       <w:r>
-        <w:t xml:space="preserve">construct all sorts of machines. This includes the [examples], and the Turing Machine. </w:t>
+        <w:t>build</w:t>
+      </w:r>
+      <w:r>
+        <w:t xml:space="preserve"> all sorts of machines. This includes the [examples], and the Turing Machine. </w:t>
       </w:r>
     </w:p>
     <w:p>
@@ -419,7 +454,17 @@
         <w:t>?</w:t>
       </w:r>
       <w:r>
-        <w:t xml:space="preserve"> And as with most difficult problems in math it’s worth finding first the easiest, non-trivial instance of the problem, and see what you find.</w:t>
+        <w:t xml:space="preserve"> And as with most difficult problems in math it’s worth finding first the easiest,</w:t>
+      </w:r>
+      <w:r>
+        <w:rPr>
+          <w:b/>
+          <w:bCs/>
+        </w:rPr>
+        <w:t xml:space="preserve"> non-trivial</w:t>
+      </w:r>
+      <w:r>
+        <w:t xml:space="preserve"> instance of the problem, and see what you find.</w:t>
       </w:r>
       <w:r>
         <w:t xml:space="preserve"> And then work your way up.</w:t>
@@ -450,9 +495,18 @@
         <w:t>As it turns out, you need only 4 pieces of information to fully define any Cellular Automaton.</w:t>
       </w:r>
       <w:r>
-        <w:t xml:space="preserve"> And they are not hard to explain</w:t>
-      </w:r>
-      <w:r>
+        <w:t xml:space="preserve"> </w:t>
+      </w:r>
+      <w:r>
+        <w:rPr>
+          <w:strike/>
+        </w:rPr>
+        <w:t>And they are not hard to explain</w:t>
+      </w:r>
+      <w:r>
+        <w:rPr>
+          <w:strike/>
+        </w:rPr>
         <w:t>, it seems like anything in this topic will be smooth sailing.</w:t>
       </w:r>
     </w:p>
@@ -530,38 +584,311 @@
         <w:jc w:val="both"/>
       </w:pPr>
       <w:r>
-        <w:t xml:space="preserve">Next we have to define our cells. What grid are we working on? And </w:t>
-      </w:r>
-      <w:r>
-        <w:t xml:space="preserve">is it </w:t>
-      </w:r>
-      <w:r>
-        <w:t>also 2 dimensional?</w:t>
-      </w:r>
-      <w:r>
-        <w:t xml:space="preserve"> The d on top tells us the dimension of the cell array, and is mostly what we will change</w:t>
-      </w:r>
-      <w:r>
-        <w:t xml:space="preserve">, but the reason for it to be written this way, is that we don’t </w:t>
-      </w:r>
-      <w:r>
-        <w:t xml:space="preserve">need to use a </w:t>
+        <w:t xml:space="preserve">Next we have to define our cells. What grid are we working on? </w:t>
+      </w:r>
+      <w:r>
+        <w:t>How many dimensions</w:t>
+      </w:r>
+      <w:r>
+        <w:t>?</w:t>
+      </w:r>
+      <w:r>
+        <w:t xml:space="preserve"> The d </w:t>
+      </w:r>
+      <w:r>
+        <w:t xml:space="preserve">you see </w:t>
+      </w:r>
+      <w:r>
+        <w:t>on top tells us the dimension of the cell array</w:t>
+      </w:r>
+      <w:r>
+        <w:t>, and w</w:t>
+      </w:r>
+      <w:r>
+        <w:t xml:space="preserve">e can change that to </w:t>
       </w:r>
       <w:r>
         <w:lastRenderedPageBreak/>
-        <w:t xml:space="preserve">square grid, some CAs are defined using </w:t>
-      </w:r>
-      <w:r>
-        <w:t>some other way of tiling the space.</w:t>
+        <w:t>any natural number</w:t>
+      </w:r>
+      <w:r>
+        <w:t xml:space="preserve">. </w:t>
+      </w:r>
+      <w:r>
+        <w:t>For our easiest case, let’s pick a dimension of 1.</w:t>
+      </w:r>
+      <w:r>
+        <w:t xml:space="preserve"> So we are going to have a strip of cells</w:t>
+      </w:r>
+    </w:p>
+    <w:p>
+      <w:pPr>
+        <w:jc w:val="both"/>
+      </w:pPr>
+      <w:r>
+        <w:t xml:space="preserve">Now, I want to stop </w:t>
+      </w:r>
+      <w:r>
+        <w:t xml:space="preserve">for </w:t>
+      </w:r>
+      <w:r>
+        <w:t>a second</w:t>
+      </w:r>
+      <w:r>
+        <w:t xml:space="preserve"> on the </w:t>
+      </w:r>
+      <w:r>
+        <w:t xml:space="preserve">notation because </w:t>
+      </w:r>
+      <w:r>
+        <w:t xml:space="preserve">there is a good reason it is </w:t>
+      </w:r>
+      <w:r>
+        <w:rPr>
+          <w:b/>
+          <w:bCs/>
+        </w:rPr>
+        <w:t>that</w:t>
+      </w:r>
+      <w:r>
+        <w:t xml:space="preserve"> way. We normally write this part with a Z for integers</w:t>
+      </w:r>
+      <w:r>
+        <w:t xml:space="preserve">, </w:t>
+      </w:r>
+      <w:r>
+        <w:t>elevated to the power of the dimension</w:t>
+      </w:r>
+      <w:r>
+        <w:t>, which gives you a set</w:t>
+      </w:r>
+      <w:r>
+        <w:t xml:space="preserve"> of tuples</w:t>
+      </w:r>
+      <w:r>
+        <w:t>. And then we say that cells are defined as members of that set.</w:t>
+      </w:r>
+      <w:r>
+        <w:t xml:space="preserve"> But you could say</w:t>
       </w:r>
       <w:r>
         <w:t xml:space="preserve"> </w:t>
       </w:r>
       <w:r>
+        <w:t>“</w:t>
+      </w:r>
+      <w:r>
+        <w:t>if we always use a Z, isn’t redundant</w:t>
+      </w:r>
+      <w:r>
+        <w:t>?</w:t>
+      </w:r>
+      <w:r>
+        <w:t xml:space="preserve"> Can’t we just write the d down?</w:t>
+      </w:r>
+      <w:r>
+        <w:t>”</w:t>
+      </w:r>
+      <w:r>
+        <w:t>. But</w:t>
+      </w:r>
+      <w:r>
+        <w:t xml:space="preserve"> </w:t>
+      </w:r>
+      <w:r>
+        <w:t xml:space="preserve">we still write the Z, </w:t>
+      </w:r>
+      <w:r>
+        <w:t>because some CAs can have a different way of tiling other than square, in which case,</w:t>
+      </w:r>
+      <w:r>
+        <w:t xml:space="preserve"> we write this part differently.</w:t>
+      </w:r>
+    </w:p>
+    <w:p>
+      <w:pPr>
+        <w:jc w:val="both"/>
+        <w:rPr>
+          <w:strike/>
+        </w:rPr>
+      </w:pPr>
+      <w:r>
+        <w:rPr>
+          <w:strike/>
+        </w:rPr>
+        <w:t xml:space="preserve">This gives us </w:t>
+      </w:r>
+      <w:r>
+        <w:rPr>
+          <w:strike/>
+        </w:rPr>
+        <w:t xml:space="preserve">a set of tuples that </w:t>
+      </w:r>
+      <w:r>
+        <w:rPr>
+          <w:strike/>
+        </w:rPr>
+        <w:t>contains</w:t>
+      </w:r>
+      <w:r>
+        <w:rPr>
+          <w:strike/>
+        </w:rPr>
+        <w:t xml:space="preserve"> all the</w:t>
+      </w:r>
+      <w:r>
+        <w:rPr>
+          <w:strike/>
+        </w:rPr>
+        <w:t xml:space="preserve"> points</w:t>
+      </w:r>
+      <w:r>
+        <w:rPr>
+          <w:strike/>
+        </w:rPr>
+        <w:t xml:space="preserve"> of a space with d dimensions</w:t>
+      </w:r>
+      <w:r>
+        <w:rPr>
+          <w:strike/>
+        </w:rPr>
+        <w:t xml:space="preserve">, whose </w:t>
+      </w:r>
+      <w:r>
+        <w:rPr>
+          <w:strike/>
+        </w:rPr>
+        <w:t>coordinates are integers</w:t>
+      </w:r>
+      <w:r>
+        <w:rPr>
+          <w:strike/>
+        </w:rPr>
+        <w:t xml:space="preserve">. </w:t>
+      </w:r>
+      <w:r>
+        <w:rPr>
+          <w:strike/>
+        </w:rPr>
+        <w:t xml:space="preserve">And we say that the cells are </w:t>
+      </w:r>
+      <w:r>
+        <w:rPr>
+          <w:strike/>
+        </w:rPr>
+        <w:t xml:space="preserve">defined as </w:t>
+      </w:r>
+      <w:r>
+        <w:rPr>
+          <w:strike/>
+        </w:rPr>
+        <w:t>those tuples</w:t>
+      </w:r>
+      <w:r>
+        <w:rPr>
+          <w:strike/>
+        </w:rPr>
+        <w:t>, or “coordinates”</w:t>
+      </w:r>
+      <w:r>
+        <w:rPr>
+          <w:strike/>
+        </w:rPr>
+        <w:t xml:space="preserve">. If you were to </w:t>
+      </w:r>
+      <w:r>
+        <w:rPr>
+          <w:strike/>
+        </w:rPr>
+        <w:t xml:space="preserve">program the game of life, like I did for the </w:t>
+      </w:r>
+      <w:r>
+        <w:rPr>
+          <w:strike/>
+        </w:rPr>
+        <w:t xml:space="preserve">visuals of this presentation, you might choose to make objects that contain the position of a cell, </w:t>
+      </w:r>
+      <w:r>
+        <w:rPr>
+          <w:strike/>
+        </w:rPr>
+        <w:t>as</w:t>
+      </w:r>
+      <w:r>
+        <w:rPr>
+          <w:strike/>
+        </w:rPr>
+        <w:t xml:space="preserve"> well as the state</w:t>
+      </w:r>
+      <w:r>
+        <w:rPr>
+          <w:strike/>
+        </w:rPr>
+        <w:t xml:space="preserve">, but formally, we define the cells to BE the positions themselves. This </w:t>
+      </w:r>
+      <w:r>
+        <w:rPr>
+          <w:strike/>
+        </w:rPr>
+        <w:t xml:space="preserve">might seem like </w:t>
+      </w:r>
+      <w:r>
+        <w:rPr>
+          <w:strike/>
+        </w:rPr>
+        <w:t xml:space="preserve">a slight caveat, </w:t>
+      </w:r>
+      <w:r>
+        <w:rPr>
+          <w:strike/>
+        </w:rPr>
+        <w:t>and it mostly is, but it does help formalize some things.</w:t>
+      </w:r>
+      <w:r>
+        <w:rPr>
+          <w:strike/>
+        </w:rPr>
+        <w:t xml:space="preserve"> And the reason I am bringing it up right now is because it </w:t>
+      </w:r>
+      <w:r>
+        <w:rPr>
+          <w:strike/>
+        </w:rPr>
+        <w:t xml:space="preserve">explains the notation. I mean, if we always use a Z, isn’t redundant. Well, </w:t>
+      </w:r>
+      <w:r>
+        <w:rPr>
+          <w:strike/>
+        </w:rPr>
+        <w:t xml:space="preserve">you could also use something different than a square grid, in which case, you would change this to reflect that. </w:t>
+      </w:r>
+    </w:p>
+    <w:p>
+      <w:pPr>
+        <w:jc w:val="both"/>
+      </w:pPr>
+      <w:r>
         <w:t xml:space="preserve">A good </w:t>
       </w:r>
       <w:r>
-        <w:t xml:space="preserve">example of this is using hexagons. As it turns out, you can model pretty well how snowflakes form using these CA. Here’s an example. And another example I found online was </w:t>
+        <w:t>example of this is using hexagons. As it turns out, you can model pretty well how snowflakes form using these CA</w:t>
+      </w:r>
+      <w:r>
+        <w:t>s</w:t>
+      </w:r>
+      <w:r>
+        <w:t>. Here’s an example.</w:t>
+      </w:r>
+    </w:p>
+    <w:p>
+      <w:pPr>
+        <w:jc w:val="both"/>
+        <w:rPr>
+          <w:strike/>
+        </w:rPr>
+      </w:pPr>
+      <w:r>
+        <w:t xml:space="preserve">And another example I found online was </w:t>
       </w:r>
       <w:r>
         <w:t xml:space="preserve">Game of Life, but </w:t>
@@ -570,49 +897,100 @@
         <w:t>made using Einstein</w:t>
       </w:r>
       <w:r>
-        <w:t xml:space="preserve"> tiling. It is a fairly recently discovered shape that is amorphous, yet it can tile the whole</w:t>
-      </w:r>
-      <w:r>
+        <w:t xml:space="preserve"> tiling</w:t>
+      </w:r>
+      <w:r>
+        <w:t>, where we use “One stone” to tile the space aperiodically</w:t>
+      </w:r>
+      <w:r>
+        <w:t xml:space="preserve">. </w:t>
+      </w:r>
+      <w:r>
+        <w:rPr>
+          <w:strike/>
+        </w:rPr>
+        <w:t>It is a fairly recently discovered shape that is amorphous, yet it can tile the whole</w:t>
+      </w:r>
+      <w:r>
+        <w:rPr>
+          <w:strike/>
+        </w:rPr>
         <w:t xml:space="preserve"> plane</w:t>
       </w:r>
       <w:r>
+        <w:rPr>
+          <w:strike/>
+        </w:rPr>
         <w:t xml:space="preserve"> in a non-periodic way</w:t>
       </w:r>
       <w:r>
+        <w:rPr>
+          <w:strike/>
+        </w:rPr>
         <w:t xml:space="preserve">. It’s called einstein </w:t>
       </w:r>
       <w:r>
+        <w:rPr>
+          <w:strike/>
+        </w:rPr>
         <w:t xml:space="preserve">because it is one stone, not because it has anything to do with the famous </w:t>
       </w:r>
       <w:proofErr w:type="spellStart"/>
       <w:r>
+        <w:rPr>
+          <w:strike/>
+        </w:rPr>
         <w:t>german</w:t>
       </w:r>
       <w:proofErr w:type="spellEnd"/>
       <w:r>
+        <w:rPr>
+          <w:strike/>
+        </w:rPr>
         <w:t xml:space="preserve"> physician.</w:t>
       </w:r>
       <w:r>
+        <w:rPr>
+          <w:strike/>
+        </w:rPr>
         <w:t xml:space="preserve"> </w:t>
       </w:r>
       <w:r>
+        <w:rPr>
+          <w:strike/>
+        </w:rPr>
         <w:t>Before this we had sets of tiles that could do the same, but whether one</w:t>
       </w:r>
       <w:r>
+        <w:rPr>
+          <w:strike/>
+        </w:rPr>
         <w:t xml:space="preserve"> </w:t>
       </w:r>
       <w:r>
+        <w:rPr>
+          <w:strike/>
+        </w:rPr>
         <w:t>tile could do it was an open question. Now we have a family of tiles.</w:t>
       </w:r>
       <w:r>
+        <w:rPr>
+          <w:strike/>
+        </w:rPr>
         <w:t xml:space="preserve"> This one was the first one as it’s called the einstein hat, because it </w:t>
       </w:r>
       <w:proofErr w:type="spellStart"/>
       <w:r>
+        <w:rPr>
+          <w:strike/>
+        </w:rPr>
         <w:t>kinda</w:t>
       </w:r>
       <w:proofErr w:type="spellEnd"/>
       <w:r>
+        <w:rPr>
+          <w:strike/>
+        </w:rPr>
         <w:t>’ looks like a hat.</w:t>
       </w:r>
     </w:p>
@@ -624,16 +1002,693 @@
         <w:t>Here</w:t>
       </w:r>
       <w:r>
-        <w:t xml:space="preserve"> is it running with an initial state where I tried to write QUICK</w:t>
-      </w:r>
-      <w:r>
-        <w:t>. We don’t know yet if it remains Turing Complete.</w:t>
-      </w:r>
-    </w:p>
-    <w:p>
-      <w:pPr>
-        <w:jc w:val="both"/>
-      </w:pPr>
+        <w:t xml:space="preserve"> i</w:t>
+      </w:r>
+      <w:r>
+        <w:t>t</w:t>
+      </w:r>
+      <w:r>
+        <w:t xml:space="preserve"> </w:t>
+      </w:r>
+      <w:r>
+        <w:t xml:space="preserve">is, </w:t>
+      </w:r>
+      <w:r>
+        <w:t>running with an initial state where I tried to write QUICK</w:t>
+      </w:r>
+      <w:r>
+        <w:t xml:space="preserve">. </w:t>
+      </w:r>
+      <w:r>
+        <w:t>How cool is that?</w:t>
+      </w:r>
+      <w:r>
+        <w:t xml:space="preserve"> </w:t>
+      </w:r>
+      <w:r>
+        <w:t xml:space="preserve">We don’t know yet if it </w:t>
+      </w:r>
+      <w:r>
+        <w:t xml:space="preserve">stays </w:t>
+      </w:r>
+      <w:r>
+        <w:t>Turing Complete.</w:t>
+      </w:r>
+      <w:r>
+        <w:t xml:space="preserve"> </w:t>
+      </w:r>
+    </w:p>
+    <w:p>
+      <w:pPr>
+        <w:pStyle w:val="Subtitle"/>
+      </w:pPr>
+      <w:r>
+        <w:t>Neighborhood index</w:t>
+      </w:r>
+    </w:p>
+    <w:p>
+      <w:pPr>
+        <w:jc w:val="both"/>
+      </w:pPr>
+      <w:r>
+        <w:t>Then we have to define our neighborhood.</w:t>
+      </w:r>
+      <w:r>
+        <w:t xml:space="preserve"> I said before that the cells in game of life count how many neighbors are alive as part of its rule, but what exactly counts as neighbors? Is it the eight</w:t>
+      </w:r>
+      <w:r>
+        <w:t xml:space="preserve"> surrounding it? Only the 4 adjacent ones, or maybe something different entirely. Well, </w:t>
+      </w:r>
+      <w:r>
+        <w:t>you define it! E</w:t>
+      </w:r>
+      <w:r>
+        <w:t xml:space="preserve">ith the game of life, it is </w:t>
+      </w:r>
+      <w:r>
+        <w:t xml:space="preserve">the </w:t>
+      </w:r>
+      <w:r>
+        <w:t xml:space="preserve">8 surrounding it, what we call the </w:t>
+      </w:r>
+      <w:r>
+        <w:t xml:space="preserve">Moore neighborhood, but </w:t>
+      </w:r>
+      <w:r>
+        <w:t xml:space="preserve">the name is </w:t>
+      </w:r>
+      <w:r>
+        <w:t>not too important</w:t>
+      </w:r>
+      <w:r>
+        <w:t xml:space="preserve">. </w:t>
+      </w:r>
+      <w:r>
+        <w:t>With other</w:t>
+      </w:r>
+      <w:r>
+        <w:t>s</w:t>
+      </w:r>
+      <w:r>
+        <w:t xml:space="preserve"> however, we might want to </w:t>
+      </w:r>
+      <w:r>
+        <w:lastRenderedPageBreak/>
+        <w:t xml:space="preserve">take a different set of cells into consideration, and that’s what the neighborhood index tells us. The neighborhood index is </w:t>
+      </w:r>
+      <w:r>
+        <w:t>a tuple containing the relative positions of the cells to take into account</w:t>
+      </w:r>
+      <w:r>
+        <w:t>. Relative to the cell itself</w:t>
+      </w:r>
+      <w:r>
+        <w:t xml:space="preserve">, where we are applying the rule. To show you what I </w:t>
+      </w:r>
+      <w:r>
+        <w:t>mean</w:t>
+      </w:r>
+      <w:r>
+        <w:t>, let’s take Game of life as an example here</w:t>
+      </w:r>
+      <w:r>
+        <w:t>. Consider we have a</w:t>
+      </w:r>
+      <w:r>
+        <w:t xml:space="preserve"> configuration</w:t>
+      </w:r>
+      <w:r>
+        <w:t xml:space="preserve">, and we want to calculate the next state of </w:t>
+      </w:r>
+      <w:r>
+        <w:t>the middle cell. T</w:t>
+      </w:r>
+      <w:r>
+        <w:t xml:space="preserve">he Moore’s </w:t>
+      </w:r>
+      <w:r>
+        <w:t>neighborhood looks like this</w:t>
+      </w:r>
+      <w:r>
+        <w:t xml:space="preserve">. The position on the screen is not important, the important </w:t>
+      </w:r>
+      <w:r>
+        <w:t>part is the order, but this way it looks cleaner. Each element of this neighborhood index has values that you could consider as vector, telling you where the neighbors are</w:t>
+      </w:r>
+      <w:r>
+        <w:t xml:space="preserve">. If we do imagine them as vectors, then whenever you want to find the neighbors of the middle cell, we have a clean, easy way of finding them, which is by adding </w:t>
+      </w:r>
+      <w:r>
+        <w:t>these</w:t>
+      </w:r>
+      <w:r>
+        <w:t xml:space="preserve"> vectors</w:t>
+      </w:r>
+      <w:r>
+        <w:t xml:space="preserve"> to the cell</w:t>
+      </w:r>
+      <w:r>
+        <w:t>.</w:t>
+      </w:r>
+      <w:r>
+        <w:t xml:space="preserve"> Now, that was not entirely true, because the middle cell is also considered a neighbor</w:t>
+      </w:r>
+      <w:r>
+        <w:t>… of itself</w:t>
+      </w:r>
+      <w:r>
+        <w:t xml:space="preserve">. </w:t>
+      </w:r>
+      <w:r>
+        <w:t>I don’t know if you consider yourself as your own neighbor, but here we do.</w:t>
+      </w:r>
+      <w:r>
+        <w:t xml:space="preserve"> </w:t>
+      </w:r>
+      <w:r>
+        <w:t xml:space="preserve">This </w:t>
+      </w:r>
+      <w:r>
+        <w:t xml:space="preserve">is so </w:t>
+      </w:r>
+      <w:r>
+        <w:t>it</w:t>
+      </w:r>
+      <w:r>
+        <w:t xml:space="preserve"> can take </w:t>
+      </w:r>
+      <w:r>
+        <w:t xml:space="preserve">into </w:t>
+      </w:r>
+      <w:r>
+        <w:t xml:space="preserve">account </w:t>
+      </w:r>
+      <w:r>
+        <w:t xml:space="preserve">its </w:t>
+      </w:r>
+      <w:r>
+        <w:t>own</w:t>
+      </w:r>
+      <w:r>
+        <w:t xml:space="preserve"> state, whether it start dead or alive.</w:t>
+      </w:r>
+      <w:r>
+        <w:t xml:space="preserve"> </w:t>
+      </w:r>
+    </w:p>
+    <w:p>
+      <w:pPr>
+        <w:jc w:val="both"/>
+      </w:pPr>
+      <w:r>
+        <w:t>Now, i</w:t>
+      </w:r>
+      <w:r>
+        <w:t>t isn’t to</w:t>
+      </w:r>
+      <w:r>
+        <w:t>o</w:t>
+      </w:r>
+      <w:r>
+        <w:t xml:space="preserve"> clear</w:t>
+      </w:r>
+      <w:r>
+        <w:t xml:space="preserve"> </w:t>
+      </w:r>
+      <w:r>
+        <w:rPr>
+          <w:b/>
+          <w:bCs/>
+        </w:rPr>
+        <w:t>when</w:t>
+      </w:r>
+      <w:r>
+        <w:t xml:space="preserve"> you might want to do this at first glance, but </w:t>
+      </w:r>
+      <w:r>
+        <w:t xml:space="preserve">you are </w:t>
+      </w:r>
+      <w:r>
+        <w:t>not required to select a neighborhood that is nearby</w:t>
+      </w:r>
+      <w:r>
+        <w:t>. It is perfectly acceptable to choose a neighborhood somewhere else, or even a disjoint one.</w:t>
+      </w:r>
+      <w:r>
+        <w:t xml:space="preserve"> They don’t even have to touch each other. </w:t>
+      </w:r>
+      <w:r>
+        <w:t xml:space="preserve">However, as it turns out, choosing between two neighborhoods that are </w:t>
+      </w:r>
+      <w:r>
+        <w:t>different only in their position, doesn’t actually have any impact other than a</w:t>
+      </w:r>
+      <w:r>
+        <w:t xml:space="preserve"> simple</w:t>
+      </w:r>
+      <w:r>
+        <w:t xml:space="preserve"> </w:t>
+      </w:r>
+      <w:r>
+        <w:t>translation</w:t>
+      </w:r>
+      <w:r>
+        <w:t xml:space="preserve">, so we tend </w:t>
+      </w:r>
+      <w:r>
+        <w:t xml:space="preserve">not </w:t>
+      </w:r>
+      <w:r>
+        <w:t>to bother with that too much</w:t>
+      </w:r>
+      <w:r>
+        <w:t>.</w:t>
+      </w:r>
+    </w:p>
+    <w:p>
+      <w:pPr>
+        <w:jc w:val="both"/>
+      </w:pPr>
+      <w:r>
+        <w:t xml:space="preserve">For our first and easiest example, we </w:t>
+      </w:r>
+      <w:r>
+        <w:t xml:space="preserve">could </w:t>
+      </w:r>
+      <w:r>
+        <w:t xml:space="preserve">choose a </w:t>
+      </w:r>
+      <w:r>
+        <w:t xml:space="preserve">neighborhood of </w:t>
+      </w:r>
+      <w:r>
+        <w:t xml:space="preserve">just one cell, </w:t>
+      </w:r>
+      <w:r>
+        <w:t xml:space="preserve">or even 2, </w:t>
+      </w:r>
+      <w:r>
+        <w:t>but that ends up making trivial CA</w:t>
+      </w:r>
+      <w:r>
+        <w:t>s</w:t>
+      </w:r>
+      <w:r>
+        <w:t xml:space="preserve">, so </w:t>
+      </w:r>
+      <w:r>
+        <w:t>for this case, we will use a neighborhood of three, centered in the</w:t>
+      </w:r>
+      <w:r>
+        <w:t xml:space="preserve"> origin</w:t>
+      </w:r>
+      <w:r>
+        <w:t>, meaning that</w:t>
+      </w:r>
+      <w:r>
+        <w:t xml:space="preserve"> the cell is its own third neighbor.</w:t>
+      </w:r>
+      <w:r>
+        <w:t xml:space="preserve"> </w:t>
+      </w:r>
+    </w:p>
+    <w:p>
+      <w:pPr>
+        <w:pStyle w:val="Subtitle"/>
+      </w:pPr>
+      <w:r>
+        <w:t>Global map</w:t>
+      </w:r>
+    </w:p>
+    <w:p>
+      <w:pPr>
+        <w:jc w:val="both"/>
+      </w:pPr>
+      <w:r>
+        <w:t xml:space="preserve">The final piece of information to create a CA is </w:t>
+      </w:r>
+      <w:r>
+        <w:t xml:space="preserve">the actual rule. </w:t>
+      </w:r>
+      <w:r>
+        <w:t>We writ</w:t>
+      </w:r>
+      <w:r>
+        <w:t>e it</w:t>
+      </w:r>
+      <w:r>
+        <w:t xml:space="preserve"> using a sigma and it is a function that takes</w:t>
+      </w:r>
+      <w:r>
+        <w:rPr>
+          <w:b/>
+          <w:bCs/>
+        </w:rPr>
+        <w:t xml:space="preserve"> </w:t>
+      </w:r>
+      <w:r>
+        <w:t>in</w:t>
+      </w:r>
+      <w:r>
+        <w:t>,</w:t>
+      </w:r>
+      <w:r>
+        <w:t xml:space="preserve"> the states of the </w:t>
+      </w:r>
+      <w:r>
+        <w:t>neighbors</w:t>
+      </w:r>
+      <w:r>
+        <w:t xml:space="preserve">, in the order that they </w:t>
+      </w:r>
+      <w:r>
+        <w:t>appear according to the neighborhood index, and outputs the next state of the current cell.</w:t>
+      </w:r>
+      <w:r>
+        <w:t xml:space="preserve"> This is what we call the transition rule, but it’s not actually what we write down in this tuple notation. </w:t>
+      </w:r>
+      <w:r>
+        <w:t>Instead,</w:t>
+      </w:r>
+      <w:r>
+        <w:t xml:space="preserve"> there is another function</w:t>
+      </w:r>
+      <w:r>
+        <w:t xml:space="preserve"> called the </w:t>
+      </w:r>
+      <w:r>
+        <w:rPr>
+          <w:u w:val="single"/>
+        </w:rPr>
+        <w:t>global map</w:t>
+      </w:r>
+      <w:r>
+        <w:t xml:space="preserve">, or </w:t>
+      </w:r>
+      <w:r>
+        <w:rPr>
+          <w:u w:val="single"/>
+        </w:rPr>
+        <w:t>global transition function</w:t>
+      </w:r>
+      <w:r>
+        <w:t>, that is the result of applying</w:t>
+      </w:r>
+      <w:r>
+        <w:t xml:space="preserve"> the </w:t>
+      </w:r>
+      <w:r>
+        <w:rPr>
+          <w:u w:val="single"/>
+        </w:rPr>
+        <w:t>local transition function</w:t>
+      </w:r>
+      <w:r>
+        <w:t xml:space="preserve">, sigma, to each cell. So this </w:t>
+      </w:r>
+      <w:r>
+        <w:t xml:space="preserve">map, which we write with tau, takes in the whole configuration, and outputs a new configuration. A configuration is </w:t>
+      </w:r>
+      <w:r>
+        <w:t xml:space="preserve">an </w:t>
+      </w:r>
+      <w:r>
+        <w:t>assignment to the states of the cells in the whole grid</w:t>
+      </w:r>
+      <w:r>
+        <w:t>.</w:t>
+      </w:r>
+    </w:p>
+    <w:p>
+      <w:pPr>
+        <w:jc w:val="both"/>
+      </w:pPr>
+      <w:r>
+        <w:t xml:space="preserve">It might seem strange that the </w:t>
+      </w:r>
+      <w:r>
+        <w:t>piece of information we are writing down here is not sigma but tau, since tau is literally defined using sigma</w:t>
+      </w:r>
+      <w:r>
+        <w:t xml:space="preserve">. But there is a good reason. </w:t>
+      </w:r>
+      <w:r>
+        <w:t>In Cellular Automata Theory, most of the wo</w:t>
+      </w:r>
+      <w:r>
+        <w:t>r</w:t>
+      </w:r>
+      <w:r>
+        <w:t>k is actually not performed around sigma, but around tau. Most of the conclusions and theorems talk about tau as a mathematical object</w:t>
+      </w:r>
+      <w:r>
+        <w:t xml:space="preserve">, and </w:t>
+      </w:r>
+      <w:r>
+        <w:lastRenderedPageBreak/>
+        <w:t xml:space="preserve">that makes it actually easier. The global map, or tau, is the </w:t>
+      </w:r>
+      <w:r>
+        <w:t>star of the show, in most cases, so it will make more sense to</w:t>
+      </w:r>
+      <w:r>
+        <w:t xml:space="preserve"> talk about tau here, than sigma, despite it being defined through</w:t>
+      </w:r>
+      <w:r>
+        <w:t xml:space="preserve"> a sigma</w:t>
+      </w:r>
+      <w:r>
+        <w:t>.</w:t>
+      </w:r>
+      <w:r>
+        <w:t xml:space="preserve"> </w:t>
+      </w:r>
+    </w:p>
+    <w:p>
+      <w:pPr>
+        <w:jc w:val="both"/>
+      </w:pPr>
+      <w:r>
+        <w:t xml:space="preserve">For our easiest case, let us set tau as a variable we can play with, meaning </w:t>
+      </w:r>
+      <w:r>
+        <w:t>all tau are allowed.</w:t>
+      </w:r>
+    </w:p>
+    <w:p>
+      <w:pPr>
+        <w:jc w:val="both"/>
+      </w:pPr>
+      <w:r>
+        <w:t>And that’s it, every cellular automaton can be fully defined with these four pieces of information</w:t>
+      </w:r>
+      <w:r>
+        <w:t xml:space="preserve">. </w:t>
+      </w:r>
+      <w:r>
+        <w:t xml:space="preserve">You might have noticed that the </w:t>
+      </w:r>
+      <w:r>
+        <w:t xml:space="preserve">initial </w:t>
+      </w:r>
+      <w:r>
+        <w:t xml:space="preserve">configuration is </w:t>
+      </w:r>
+      <w:r>
+        <w:t xml:space="preserve">not a part of the definition. </w:t>
+      </w:r>
+      <w:r>
+        <w:t>So it doesn’t matter what cells start alive and which ones</w:t>
+      </w:r>
+      <w:r>
+        <w:t xml:space="preserve"> </w:t>
+      </w:r>
+      <w:r>
+        <w:t>dead, it is still considered the same CA.</w:t>
+      </w:r>
+    </w:p>
+    <w:p>
+      <w:pPr>
+        <w:pStyle w:val="Subtitle"/>
+      </w:pPr>
+      <w:r>
+        <w:t>Elementary Cellular Automata</w:t>
+      </w:r>
+    </w:p>
+    <w:p>
+      <w:pPr>
+        <w:jc w:val="both"/>
+      </w:pPr>
+      <w:r>
+        <w:t xml:space="preserve">Now let’s take a look at the CAs’ family that we crafted. </w:t>
+      </w:r>
+      <w:r>
+        <w:t>They use a binary state alphabet</w:t>
+      </w:r>
+      <w:r>
+        <w:t xml:space="preserve">, they are on a </w:t>
+      </w:r>
+      <w:r>
+        <w:t>1-dimensional</w:t>
+      </w:r>
+      <w:r>
+        <w:t xml:space="preserve"> strip of cells, and their neighborhood</w:t>
+      </w:r>
+      <w:r>
+        <w:t xml:space="preserve"> encompasses themselves and the two cells to their sides. </w:t>
+      </w:r>
+      <w:r>
+        <w:t>Th</w:t>
+      </w:r>
+      <w:r>
+        <w:t>ese</w:t>
+      </w:r>
+      <w:r>
+        <w:t xml:space="preserve"> happen to have a name, they’re called the “Elementary Cellular Automata”</w:t>
+      </w:r>
+      <w:r>
+        <w:t>, and they serve to study some of the properties of all CAs</w:t>
+      </w:r>
+      <w:r>
+        <w:t xml:space="preserve">. The first thing we can do is to calculate how many we have, and this might give us a </w:t>
+      </w:r>
+      <w:r>
+        <w:t>bit of an intuition into how to work with these.</w:t>
+      </w:r>
+    </w:p>
+    <w:p>
+      <w:pPr>
+        <w:jc w:val="both"/>
+      </w:pPr>
+      <w:r>
+        <w:t xml:space="preserve">The only thing that we set as a variable is the </w:t>
+      </w:r>
+      <w:r>
+        <w:t>global function. And we said it’s defined by a</w:t>
+      </w:r>
+      <w:r>
+        <w:t xml:space="preserve"> local transition function</w:t>
+      </w:r>
+      <w:r>
+        <w:t xml:space="preserve">. That </w:t>
+      </w:r>
+      <w:r>
+        <w:t xml:space="preserve">transition function </w:t>
+      </w:r>
+      <w:r>
+        <w:t xml:space="preserve">takes 3 states, because there are three neighbors, and output one state. </w:t>
+      </w:r>
+      <w:r>
+        <w:t xml:space="preserve">We can easily write them </w:t>
+      </w:r>
+      <w:r>
+        <w:t>into a truth table</w:t>
+      </w:r>
+      <w:r>
+        <w:t>, like this</w:t>
+      </w:r>
+      <w:r>
+        <w:t>, order</w:t>
+      </w:r>
+      <w:r>
+        <w:t>ing</w:t>
+      </w:r>
+      <w:r>
+        <w:t xml:space="preserve"> the neighbors</w:t>
+      </w:r>
+      <w:r>
+        <w:t xml:space="preserve"> as if they were binary numbers</w:t>
+      </w:r>
+      <w:r>
+        <w:t>.</w:t>
+      </w:r>
+      <w:r>
+        <w:t xml:space="preserve"> Then depending on</w:t>
+      </w:r>
+      <w:r>
+        <w:t xml:space="preserve"> which</w:t>
+      </w:r>
+      <w:r>
+        <w:t xml:space="preserve"> rows get a 1 and which </w:t>
+      </w:r>
+      <w:r>
+        <w:t xml:space="preserve">get a 0, we get one CA or another. </w:t>
+      </w:r>
+      <w:r>
+        <w:t>The “do nothing” for example, looks like this.</w:t>
+      </w:r>
+    </w:p>
+    <w:p>
+      <w:pPr>
+        <w:jc w:val="both"/>
+      </w:pPr>
+      <w:r>
+        <w:t>And the “just flip” function looks like this. These are names I am them right now, but they actually already a name. Given</w:t>
+      </w:r>
+      <w:r>
+        <w:t xml:space="preserve"> that they are so few, </w:t>
+      </w:r>
+      <w:r>
+        <w:t>there is this naming convention called the Wolfram scheme, which assigns a number to each of the rules</w:t>
+      </w:r>
+      <w:r>
+        <w:t xml:space="preserve">, this one is called Rule </w:t>
+      </w:r>
+      <w:r>
+        <w:t xml:space="preserve">51 and this one is </w:t>
+      </w:r>
+      <w:r>
+        <w:t>204. To get the numbers what you have to do is simply take this row, and read it as if it was in binary</w:t>
+      </w:r>
+      <w:r>
+        <w:t>.</w:t>
+      </w:r>
+    </w:p>
+    <w:p>
+      <w:pPr>
+        <w:jc w:val="both"/>
+      </w:pPr>
+      <w:r>
+        <w:t xml:space="preserve">Now to calculate how many elementary CAs there are, it’s as easy as </w:t>
+      </w:r>
+      <w:r>
+        <w:t>2 to the 8</w:t>
+      </w:r>
+      <w:r>
+        <w:rPr>
+          <w:vertAlign w:val="superscript"/>
+        </w:rPr>
+        <w:t>th</w:t>
+      </w:r>
+      <w:r>
+        <w:t>, which is 256</w:t>
+      </w:r>
+      <w:r>
+        <w:t>. …Except, not actually.</w:t>
+      </w:r>
+    </w:p>
+    <w:p>
+      <w:pPr>
+        <w:jc w:val="both"/>
+      </w:pPr>
+      <w:r>
+        <w:t>You see,</w:t>
+      </w:r>
+      <w:r>
+        <w:t xml:space="preserve"> </w:t>
+      </w:r>
+      <w:r>
+        <w:t>although in theory there are 256, for each</w:t>
+      </w:r>
+      <w:r>
+        <w:t xml:space="preserve"> CA, you can simply flip the result, and get a new CA, without adding</w:t>
+      </w:r>
+      <w:r>
+        <w:t xml:space="preserve"> new complexity. So from the 256, half are basically the same as the other half. </w:t>
+      </w:r>
+      <w:r>
+        <w:t xml:space="preserve">So just 128. </w:t>
+      </w:r>
     </w:p>
     <w:sectPr>
       <w:pgSz w:w="12240" w:h="15840"/>

</xml_diff>

<commit_message>
Added rule 90 and started 110 in the script
</commit_message>
<xml_diff>
--- a/Script.docx
+++ b/Script.docx
@@ -1160,10 +1160,7 @@
         <w:t xml:space="preserve">. </w:t>
       </w:r>
       <w:r>
-        <w:t>I don’t know if you consider yourself as your own neighbor, but here we do.</w:t>
-      </w:r>
-      <w:r>
-        <w:t xml:space="preserve"> </w:t>
+        <w:t xml:space="preserve">I don’t know if you consider yourself as your own neighbor, but here we do. </w:t>
       </w:r>
       <w:r>
         <w:t xml:space="preserve">This </w:t>
@@ -1666,28 +1663,145 @@
       <w:r>
         <w:t>. …Except, not actually.</w:t>
       </w:r>
-    </w:p>
-    <w:p>
-      <w:pPr>
-        <w:jc w:val="both"/>
-      </w:pPr>
-      <w:r>
-        <w:t>You see,</w:t>
-      </w:r>
-      <w:r>
-        <w:t xml:space="preserve"> </w:t>
-      </w:r>
-      <w:r>
-        <w:t>although in theory there are 256, for each</w:t>
-      </w:r>
-      <w:r>
-        <w:t xml:space="preserve"> CA, you can simply flip the result, and get a new CA, without adding</w:t>
-      </w:r>
-      <w:r>
-        <w:t xml:space="preserve"> new complexity. So from the 256, half are basically the same as the other half. </w:t>
-      </w:r>
-      <w:r>
-        <w:t xml:space="preserve">So just 128. </w:t>
+      <w:r>
+        <w:t xml:space="preserve"> Most of them are either mirror version or flipped version of other, where you simply flip the ones and zeroes, which doesn’t give you </w:t>
+      </w:r>
+      <w:proofErr w:type="spellStart"/>
+      <w:r>
+        <w:t>new</w:t>
+      </w:r>
+      <w:proofErr w:type="spellEnd"/>
+      <w:r>
+        <w:t xml:space="preserve"> complexity, so more realistically, we have 88 different elementary CA.</w:t>
+      </w:r>
+    </w:p>
+    <w:p>
+      <w:pPr>
+        <w:jc w:val="both"/>
+      </w:pPr>
+      <w:r>
+        <w:t>Now, let me show you some interesting Elementary C</w:t>
+      </w:r>
+      <w:r>
+        <w:t>A</w:t>
+      </w:r>
+      <w:r>
+        <w:t>s.</w:t>
+      </w:r>
+    </w:p>
+    <w:p>
+      <w:pPr>
+        <w:jc w:val="both"/>
+      </w:pPr>
+      <w:r>
+        <w:t>This is the rule 90</w:t>
+      </w:r>
+      <w:r>
+        <w:t xml:space="preserve">, which is simply an </w:t>
+      </w:r>
+      <w:proofErr w:type="spellStart"/>
+      <w:r>
+        <w:t>xor</w:t>
+      </w:r>
+      <w:proofErr w:type="spellEnd"/>
+      <w:r>
+        <w:t xml:space="preserve"> of the right and left cell</w:t>
+      </w:r>
+      <w:r>
+        <w:t>. As you can see… It is hard to know what’s going on</w:t>
+      </w:r>
+      <w:r>
+        <w:t xml:space="preserve"> when it is one dimensional. Because of this, when </w:t>
+      </w:r>
+      <w:r>
+        <w:lastRenderedPageBreak/>
+        <w:t>simulating one dimensional CAs, we use the second dimension to show time. In that case, Rule 90 looks like this.</w:t>
+      </w:r>
+    </w:p>
+    <w:p>
+      <w:pPr>
+        <w:jc w:val="both"/>
+      </w:pPr>
+      <w:r>
+        <w:t xml:space="preserve">It’s the </w:t>
+      </w:r>
+      <w:proofErr w:type="spellStart"/>
+      <w:r>
+        <w:t>Sierpiński</w:t>
+      </w:r>
+      <w:proofErr w:type="spellEnd"/>
+      <w:r>
+        <w:t> </w:t>
+      </w:r>
+      <w:r>
+        <w:t>(</w:t>
+      </w:r>
+      <w:r>
+        <w:t>shyer-PYIN-ski</w:t>
+      </w:r>
+      <w:r>
+        <w:t>) triangle! This happens whenever you start with a single alive cell in the middle and dead anywhere else, which we call the primitive configuration</w:t>
+      </w:r>
+      <w:r>
+        <w:t>. With alive I mean a 1. This CA is also interesting for reasons we will see later.</w:t>
+      </w:r>
+    </w:p>
+    <w:p>
+      <w:pPr>
+        <w:jc w:val="both"/>
+      </w:pPr>
+      <w:r>
+        <w:t>Another one I want to show you is Rule 110, or how I call it, Left life. I don’t actually know where I got the name from. I thought I read it somewhere, but after searching for it a bit, I might actually have invented it by accident. But it is a very fitting name.</w:t>
+      </w:r>
+    </w:p>
+    <w:p>
+      <w:pPr>
+        <w:jc w:val="both"/>
+      </w:pPr>
+      <w:r>
+        <w:t xml:space="preserve">Rule 110, or left life, has a ruleset </w:t>
+      </w:r>
+      <w:r>
+        <w:t>that reminds that of life.</w:t>
+      </w:r>
+      <w:r>
+        <w:t xml:space="preserve"> An alive cell will dead only by overpopulation, meaning it has 2 alive neighbors. </w:t>
+      </w:r>
+      <w:r>
+        <w:t>A dead cell will simply copy the right cell. And so</w:t>
+      </w:r>
+      <w:r>
+        <w:t>,</w:t>
+      </w:r>
+      <w:r>
+        <w:t xml:space="preserve"> life propagates to the left until you get a row of consecutive ones.</w:t>
+      </w:r>
+    </w:p>
+    <w:p>
+      <w:pPr>
+        <w:jc w:val="both"/>
+      </w:pPr>
+      <w:r>
+        <w:t>If we start with the primitive configuration, we get this triangle structure. The surprising thing from left life is that, just life the game of life, it is Turing Complete. You can build a Turing Machine by carefully choosing the initial configuration.</w:t>
+      </w:r>
+      <w:r>
+        <w:t xml:space="preserve"> And here we can see a bit of how that works. If you look at this zone right here, you might notice that this area is periodic. It looks like background noise that just repeats. This is what we call the Ether.</w:t>
+      </w:r>
+    </w:p>
+    <w:p>
+      <w:pPr>
+        <w:jc w:val="both"/>
+      </w:pPr>
+      <w:r>
+        <w:t xml:space="preserve">If you build a configuration consisting solely of the ether, you get the ether back. But that’s not the only thing that Left </w:t>
+      </w:r>
+      <w:proofErr w:type="spellStart"/>
+      <w:r>
+        <w:t>life</w:t>
+      </w:r>
+      <w:proofErr w:type="spellEnd"/>
+      <w:r>
+        <w:t xml:space="preserve"> creates. If we take a look at the right side, we can find this structure that moves slowly to the left. This is what we call a glider, because it glides from one side to the other </w:t>
       </w:r>
     </w:p>
     <w:sectPr>
@@ -2423,7 +2537,6 @@
   <w:style w:type="character" w:default="1" w:styleId="DefaultParagraphFont">
     <w:name w:val="Default Paragraph Font"/>
     <w:uiPriority w:val="1"/>
-    <w:semiHidden/>
     <w:unhideWhenUsed/>
   </w:style>
   <w:style w:type="table" w:default="1" w:styleId="TableNormal">

</xml_diff>